<commit_message>
HoiDong_DaoDuc doc v2: them Section VII mau ho so thuc te tu HMU PDF chinh thuc (Mau 1 Don xin, Mau 4 Ban cung cap thong tin 13 muc, Mau 5 Phieu tinh nguyen, Mau 6 Cam ket) + Section VIII co so phap ly hien hanh Thong tu 43/2024/TT-BYT hieu luc 01/02/2025 (3 loai QD Tham dinh/Phe duyet/Ket qua) + 3 refs moi (TT43/2024, HMU PDF, QD 672 BV Nguyen Tri Phuong)
</commit_message>
<xml_diff>
--- a/bai-bao-Q1/HoiDong_DaoDuc_TraLoiNMD_08062026.docx
+++ b/bai-bao-Q1/HoiDong_DaoDuc_TraLoiNMD_08062026.docx
@@ -1123,6 +1123,678 @@
           <w:color w:val="C00000"/>
           <w:sz w:val="26"/>
         </w:rPr>
+        <w:t>VII. MẪU HỒ SƠ THỰC TẾ TỪ ĐẠI HỌC Y HÀ NỘI (HMU)</w:t>
+      </w:r>
+    </w:p>
+    <w:p>
+      <w:pPr>
+        <w:spacing w:after="80"/>
+        <w:ind w:firstLine="283"/>
+        <w:jc w:val="both"/>
+      </w:pPr>
+      <w:r>
+        <w:rPr>
+          <w:rFonts w:ascii="Times New Roman" w:hAnsi="Times New Roman"/>
+          <w:sz w:val="22"/>
+        </w:rPr>
+        <w:t>Em đã trích trực tiếp từ PDF chính thức của HMU (Hướng dẫn lập hồ sơ xin phê duyệt + nghiệm thu kết quả nghiên cứu, thực hiện đạo đức nghiên cứu của đề tài). Tài liệu này dựa trên Quyết định 111/QĐ-BYT ngày 11/01/2013. Lưu ý: từ 01/02/2025, Thông tư 43/2024/TT-BYT đã thay thế nên mẫu mới có thể khác đôi chút — NCS nên hỏi Phòng KHCN HNUE để cập nhật.</w:t>
+      </w:r>
+    </w:p>
+    <w:p>
+      <w:pPr>
+        <w:spacing w:before="160" w:after="60"/>
+      </w:pPr>
+      <w:r>
+        <w:rPr>
+          <w:rFonts w:ascii="Times New Roman" w:hAnsi="Times New Roman"/>
+          <w:b/>
+          <w:color w:val="2E74B5"/>
+          <w:sz w:val="24"/>
+        </w:rPr>
+        <w:t>7.1 — Danh mục hồ sơ xin đánh giá đạo đức (HMU)</w:t>
+      </w:r>
+    </w:p>
+    <w:p>
+      <w:pPr>
+        <w:spacing w:after="60"/>
+        <w:ind w:left="425"/>
+      </w:pPr>
+      <w:r>
+        <w:rPr>
+          <w:rFonts w:ascii="Times New Roman" w:hAnsi="Times New Roman"/>
+          <w:sz w:val="22"/>
+        </w:rPr>
+        <w:t>• Đơn xin đánh giá đạo đức trong nghiên cứu (Mẫu 1)</w:t>
+      </w:r>
+    </w:p>
+    <w:p>
+      <w:pPr>
+        <w:spacing w:after="60"/>
+        <w:ind w:left="425"/>
+      </w:pPr>
+      <w:r>
+        <w:rPr>
+          <w:rFonts w:ascii="Times New Roman" w:hAnsi="Times New Roman"/>
+          <w:sz w:val="22"/>
+        </w:rPr>
+        <w:t>• Đề cương nghiên cứu (Mẫu 2 — Thuyết minh đề tài)</w:t>
+      </w:r>
+    </w:p>
+    <w:p>
+      <w:pPr>
+        <w:spacing w:after="60"/>
+        <w:ind w:left="425"/>
+      </w:pPr>
+      <w:r>
+        <w:rPr>
+          <w:rFonts w:ascii="Times New Roman" w:hAnsi="Times New Roman"/>
+          <w:sz w:val="22"/>
+        </w:rPr>
+        <w:t>• Lý lịch khoa học chủ nhiệm + nghiên cứu viên chính (Mẫu 3)</w:t>
+      </w:r>
+    </w:p>
+    <w:p>
+      <w:pPr>
+        <w:spacing w:after="60"/>
+        <w:ind w:left="425"/>
+      </w:pPr>
+      <w:r>
+        <w:rPr>
+          <w:rFonts w:ascii="Times New Roman" w:hAnsi="Times New Roman"/>
+          <w:sz w:val="22"/>
+        </w:rPr>
+        <w:t>• Chứng nhận thực hành lâm sàng tốt (nếu có)</w:t>
+      </w:r>
+    </w:p>
+    <w:p>
+      <w:pPr>
+        <w:spacing w:after="60"/>
+        <w:ind w:left="425"/>
+      </w:pPr>
+      <w:r>
+        <w:rPr>
+          <w:rFonts w:ascii="Times New Roman" w:hAnsi="Times New Roman"/>
+          <w:sz w:val="22"/>
+        </w:rPr>
+        <w:t>• Bản cung cấp thông tin cho đối tượng nghiên cứu (Mẫu 4)</w:t>
+      </w:r>
+    </w:p>
+    <w:p>
+      <w:pPr>
+        <w:spacing w:after="60"/>
+        <w:ind w:left="425"/>
+      </w:pPr>
+      <w:r>
+        <w:rPr>
+          <w:rFonts w:ascii="Times New Roman" w:hAnsi="Times New Roman"/>
+          <w:sz w:val="22"/>
+        </w:rPr>
+        <w:t>• Đơn tình nguyện tham gia nghiên cứu (Mẫu 5)</w:t>
+      </w:r>
+    </w:p>
+    <w:p>
+      <w:pPr>
+        <w:spacing w:after="60"/>
+        <w:ind w:left="425"/>
+      </w:pPr>
+      <w:r>
+        <w:rPr>
+          <w:rFonts w:ascii="Times New Roman" w:hAnsi="Times New Roman"/>
+          <w:sz w:val="22"/>
+        </w:rPr>
+        <w:t>• Bản cam kết thực hiện đúng nguyên tắc đạo đức (Mẫu 6)</w:t>
+      </w:r>
+    </w:p>
+    <w:p>
+      <w:pPr>
+        <w:spacing w:after="60"/>
+        <w:ind w:left="425"/>
+      </w:pPr>
+      <w:r>
+        <w:rPr>
+          <w:rFonts w:ascii="Times New Roman" w:hAnsi="Times New Roman"/>
+          <w:sz w:val="22"/>
+        </w:rPr>
+        <w:t>• Cam kết tài trợ cho nghiên cứu (nếu có)</w:t>
+      </w:r>
+    </w:p>
+    <w:p>
+      <w:pPr>
+        <w:spacing w:before="160" w:after="60"/>
+      </w:pPr>
+      <w:r>
+        <w:rPr>
+          <w:rFonts w:ascii="Times New Roman" w:hAnsi="Times New Roman"/>
+          <w:b/>
+          <w:color w:val="2E74B5"/>
+          <w:sz w:val="24"/>
+        </w:rPr>
+        <w:t>7.2 — Mẫu 1: Đơn xin đánh giá đạo đức (cấu trúc đầy đủ)</w:t>
+      </w:r>
+    </w:p>
+    <w:p>
+      <w:pPr>
+        <w:spacing w:after="80"/>
+        <w:ind w:firstLine="283"/>
+        <w:jc w:val="both"/>
+      </w:pPr>
+      <w:r>
+        <w:rPr>
+          <w:rFonts w:ascii="Times New Roman" w:hAnsi="Times New Roman"/>
+          <w:sz w:val="22"/>
+        </w:rPr>
+        <w:t>Kính gửi: Hội đồng Đạo đức trong nghiên cứu Y sinh học - [tên cơ quan]</w:t>
+      </w:r>
+    </w:p>
+    <w:p>
+      <w:pPr>
+        <w:spacing w:after="80"/>
+        <w:ind w:firstLine="283"/>
+        <w:jc w:val="both"/>
+      </w:pPr>
+      <w:r>
+        <w:rPr>
+          <w:rFonts w:ascii="Times New Roman" w:hAnsi="Times New Roman"/>
+          <w:sz w:val="22"/>
+        </w:rPr>
+        <w:t>1. Họ và tên Chủ nhiệm đề tài/dự án + Đơn vị + Địa chỉ + Điện thoại + Email + Fax</w:t>
+      </w:r>
+    </w:p>
+    <w:p>
+      <w:pPr>
+        <w:spacing w:after="80"/>
+        <w:ind w:firstLine="283"/>
+        <w:jc w:val="both"/>
+      </w:pPr>
+      <w:r>
+        <w:rPr>
+          <w:rFonts w:ascii="Times New Roman" w:hAnsi="Times New Roman"/>
+          <w:sz w:val="22"/>
+        </w:rPr>
+        <w:t>2. Tên đề tài/dự án xin đánh giá đạo đức trong nghiên cứu</w:t>
+      </w:r>
+    </w:p>
+    <w:p>
+      <w:pPr>
+        <w:spacing w:after="80"/>
+        <w:ind w:firstLine="283"/>
+        <w:jc w:val="both"/>
+      </w:pPr>
+      <w:r>
+        <w:rPr>
+          <w:rFonts w:ascii="Times New Roman" w:hAnsi="Times New Roman"/>
+          <w:sz w:val="22"/>
+        </w:rPr>
+        <w:t>3. Tên đơn vị chủ trì đề tài/dự án + Đơn vị + Địa chỉ + Liên hệ</w:t>
+      </w:r>
+    </w:p>
+    <w:p>
+      <w:pPr>
+        <w:spacing w:after="80"/>
+        <w:ind w:firstLine="283"/>
+        <w:jc w:val="both"/>
+      </w:pPr>
+      <w:r>
+        <w:rPr>
+          <w:rFonts w:ascii="Times New Roman" w:hAnsi="Times New Roman"/>
+          <w:sz w:val="22"/>
+        </w:rPr>
+        <w:t>4. Địa điểm, thời gian triển khai nghiên cứu</w:t>
+      </w:r>
+    </w:p>
+    <w:p>
+      <w:pPr>
+        <w:spacing w:after="80"/>
+        <w:ind w:firstLine="283"/>
+        <w:jc w:val="both"/>
+      </w:pPr>
+      <w:r>
+        <w:rPr>
+          <w:rFonts w:ascii="Times New Roman" w:hAnsi="Times New Roman"/>
+          <w:sz w:val="22"/>
+        </w:rPr>
+        <w:t>5. Hồ sơ gửi kèm: Đề cương, Lý lịch khoa học, Bản cung cấp thông tin + phiếu tình nguyện, Bản cam kết đạo đức, Tài liệu khoa học liên quan</w:t>
+      </w:r>
+    </w:p>
+    <w:p>
+      <w:pPr>
+        <w:spacing w:after="80"/>
+        <w:ind w:firstLine="283"/>
+        <w:jc w:val="both"/>
+      </w:pPr>
+      <w:r>
+        <w:rPr>
+          <w:rFonts w:ascii="Times New Roman" w:hAnsi="Times New Roman"/>
+          <w:sz w:val="22"/>
+        </w:rPr>
+        <w:t>Cuối: Ký tên — Thủ trưởng Cơ quan chủ trì + Chủ nhiệm đề tài</w:t>
+      </w:r>
+    </w:p>
+    <w:p>
+      <w:pPr>
+        <w:spacing w:before="160" w:after="60"/>
+      </w:pPr>
+      <w:r>
+        <w:rPr>
+          <w:rFonts w:ascii="Times New Roman" w:hAnsi="Times New Roman"/>
+          <w:b/>
+          <w:color w:val="2E74B5"/>
+          <w:sz w:val="24"/>
+        </w:rPr>
+        <w:t>7.3 — Mẫu 4: Bản cung cấp thông tin cho đối tượng (13 mục)</w:t>
+      </w:r>
+    </w:p>
+    <w:p>
+      <w:pPr>
+        <w:spacing w:after="60"/>
+        <w:ind w:left="425"/>
+      </w:pPr>
+      <w:r>
+        <w:rPr>
+          <w:rFonts w:ascii="Times New Roman" w:hAnsi="Times New Roman"/>
+          <w:sz w:val="22"/>
+        </w:rPr>
+        <w:t>• Tên nghiên cứu + Phiên bản + Ngày + Tên nhà tài trợ + Mã số đối tượng</w:t>
+      </w:r>
+    </w:p>
+    <w:p>
+      <w:pPr>
+        <w:spacing w:after="60"/>
+        <w:ind w:left="425"/>
+      </w:pPr>
+      <w:r>
+        <w:rPr>
+          <w:rFonts w:ascii="Times New Roman" w:hAnsi="Times New Roman"/>
+          <w:sz w:val="22"/>
+        </w:rPr>
+        <w:t>• 1. Mục đích nghiên cứu + Khoảng thời gian + Phương pháp</w:t>
+      </w:r>
+    </w:p>
+    <w:p>
+      <w:pPr>
+        <w:spacing w:after="60"/>
+        <w:ind w:left="425"/>
+      </w:pPr>
+      <w:r>
+        <w:rPr>
+          <w:rFonts w:ascii="Times New Roman" w:hAnsi="Times New Roman"/>
+          <w:sz w:val="22"/>
+        </w:rPr>
+        <w:t>• 2. Tiêu chuẩn lựa chọn đối tượng</w:t>
+      </w:r>
+    </w:p>
+    <w:p>
+      <w:pPr>
+        <w:spacing w:after="60"/>
+        <w:ind w:left="425"/>
+      </w:pPr>
+      <w:r>
+        <w:rPr>
+          <w:rFonts w:ascii="Times New Roman" w:hAnsi="Times New Roman"/>
+          <w:sz w:val="22"/>
+        </w:rPr>
+        <w:t>• 3. Tiêu chuẩn loại trừ</w:t>
+      </w:r>
+    </w:p>
+    <w:p>
+      <w:pPr>
+        <w:spacing w:after="60"/>
+        <w:ind w:left="425"/>
+      </w:pPr>
+      <w:r>
+        <w:rPr>
+          <w:rFonts w:ascii="Times New Roman" w:hAnsi="Times New Roman"/>
+          <w:sz w:val="22"/>
+        </w:rPr>
+        <w:t>• 4. Người đánh giá thông tin cá nhân/y khoa để chọn</w:t>
+      </w:r>
+    </w:p>
+    <w:p>
+      <w:pPr>
+        <w:spacing w:after="60"/>
+        <w:ind w:left="425"/>
+      </w:pPr>
+      <w:r>
+        <w:rPr>
+          <w:rFonts w:ascii="Times New Roman" w:hAnsi="Times New Roman"/>
+          <w:sz w:val="22"/>
+        </w:rPr>
+        <w:t>• 5. Số người sẽ tham gia</w:t>
+      </w:r>
+    </w:p>
+    <w:p>
+      <w:pPr>
+        <w:spacing w:after="60"/>
+        <w:ind w:left="425"/>
+      </w:pPr>
+      <w:r>
+        <w:rPr>
+          <w:rFonts w:ascii="Times New Roman" w:hAnsi="Times New Roman"/>
+          <w:sz w:val="22"/>
+        </w:rPr>
+        <w:t>• 6. Rủi ro/bất lợi có thể xảy ra</w:t>
+      </w:r>
+    </w:p>
+    <w:p>
+      <w:pPr>
+        <w:spacing w:after="60"/>
+        <w:ind w:left="425"/>
+      </w:pPr>
+      <w:r>
+        <w:rPr>
+          <w:rFonts w:ascii="Times New Roman" w:hAnsi="Times New Roman"/>
+          <w:sz w:val="22"/>
+        </w:rPr>
+        <w:t>• 7. Lợi ích cho đối tượng + cộng đồng</w:t>
+      </w:r>
+    </w:p>
+    <w:p>
+      <w:pPr>
+        <w:spacing w:after="60"/>
+        <w:ind w:left="425"/>
+      </w:pPr>
+      <w:r>
+        <w:rPr>
+          <w:rFonts w:ascii="Times New Roman" w:hAnsi="Times New Roman"/>
+          <w:sz w:val="22"/>
+        </w:rPr>
+        <w:t>• 8. Khoản chi trả trong nghiên cứu</w:t>
+      </w:r>
+    </w:p>
+    <w:p>
+      <w:pPr>
+        <w:spacing w:after="60"/>
+        <w:ind w:left="425"/>
+      </w:pPr>
+      <w:r>
+        <w:rPr>
+          <w:rFonts w:ascii="Times New Roman" w:hAnsi="Times New Roman"/>
+          <w:sz w:val="22"/>
+        </w:rPr>
+        <w:t>• 9. Phương pháp/cách điều trị thay thế</w:t>
+      </w:r>
+    </w:p>
+    <w:p>
+      <w:pPr>
+        <w:spacing w:after="60"/>
+        <w:ind w:left="425"/>
+      </w:pPr>
+      <w:r>
+        <w:rPr>
+          <w:rFonts w:ascii="Times New Roman" w:hAnsi="Times New Roman"/>
+          <w:sz w:val="22"/>
+        </w:rPr>
+        <w:t>• 10. Phương pháp lưu giữ mật hồ sơ</w:t>
+      </w:r>
+    </w:p>
+    <w:p>
+      <w:pPr>
+        <w:spacing w:after="60"/>
+        <w:ind w:left="425"/>
+      </w:pPr>
+      <w:r>
+        <w:rPr>
+          <w:rFonts w:ascii="Times New Roman" w:hAnsi="Times New Roman"/>
+          <w:sz w:val="22"/>
+        </w:rPr>
+        <w:t>• 11. Cơ quan quản lý có thể kiểm tra hồ sơ</w:t>
+      </w:r>
+    </w:p>
+    <w:p>
+      <w:pPr>
+        <w:spacing w:after="60"/>
+        <w:ind w:left="425"/>
+      </w:pPr>
+      <w:r>
+        <w:rPr>
+          <w:rFonts w:ascii="Times New Roman" w:hAnsi="Times New Roman"/>
+          <w:sz w:val="22"/>
+        </w:rPr>
+        <w:t>• 12. Vấn đề bồi thường/điều trị nếu có thương tích</w:t>
+      </w:r>
+    </w:p>
+    <w:p>
+      <w:pPr>
+        <w:spacing w:after="60"/>
+        <w:ind w:left="425"/>
+      </w:pPr>
+      <w:r>
+        <w:rPr>
+          <w:rFonts w:ascii="Times New Roman" w:hAnsi="Times New Roman"/>
+          <w:sz w:val="22"/>
+        </w:rPr>
+        <w:t>• 13. Người liên hệ khi có câu hỏi + nêu rõ tham gia tình nguyện, có quyền rút lui</w:t>
+      </w:r>
+    </w:p>
+    <w:p>
+      <w:pPr>
+        <w:spacing w:before="160" w:after="60"/>
+      </w:pPr>
+      <w:r>
+        <w:rPr>
+          <w:rFonts w:ascii="Times New Roman" w:hAnsi="Times New Roman"/>
+          <w:b/>
+          <w:color w:val="2E74B5"/>
+          <w:sz w:val="24"/>
+        </w:rPr>
+        <w:t>7.4 — Mẫu 5-A: Phiếu tình nguyện tham gia (chấp thuận)</w:t>
+      </w:r>
+    </w:p>
+    <w:p>
+      <w:pPr>
+        <w:spacing w:after="80"/>
+        <w:ind w:firstLine="283"/>
+        <w:jc w:val="both"/>
+      </w:pPr>
+      <w:r>
+        <w:rPr>
+          <w:rFonts w:ascii="Times New Roman" w:hAnsi="Times New Roman"/>
+          <w:sz w:val="22"/>
+        </w:rPr>
+        <w:t>Áp dụng cho đối tượng tình nguyện. Đặc biệt: với học sinh THCS (11-14 tuổi, dưới tuổi vị thành niên hợp pháp 18 ở Việt Nam), CẦN: (a) Phiếu tình nguyện ký bởi cha/mẹ/người giám hộ, và (b) Phiếu đồng thuận ký bởi học sinh.</w:t>
+      </w:r>
+    </w:p>
+    <w:p>
+      <w:pPr>
+        <w:spacing w:before="160" w:after="60"/>
+      </w:pPr>
+      <w:r>
+        <w:rPr>
+          <w:rFonts w:ascii="Times New Roman" w:hAnsi="Times New Roman"/>
+          <w:b/>
+          <w:color w:val="2E74B5"/>
+          <w:sz w:val="24"/>
+        </w:rPr>
+        <w:t>7.5 — Mẫu 6: Bản cam kết của nghiên cứu viên</w:t>
+      </w:r>
+    </w:p>
+    <w:p>
+      <w:pPr>
+        <w:spacing w:after="80"/>
+        <w:ind w:firstLine="283"/>
+        <w:jc w:val="both"/>
+      </w:pPr>
+      <w:r>
+        <w:rPr>
+          <w:rFonts w:ascii="Times New Roman" w:hAnsi="Times New Roman"/>
+          <w:sz w:val="22"/>
+        </w:rPr>
+        <w:t>Nghiên cứu viên cam kết thực hiện đúng các nguyên tắc đạo đức theo Tuyên bố Helsinki + GCP (Good Clinical Practice) + quy định Việt Nam.</w:t>
+      </w:r>
+    </w:p>
+    <w:p>
+      <w:pPr>
+        <w:spacing w:before="280" w:after="120"/>
+      </w:pPr>
+      <w:r>
+        <w:rPr>
+          <w:rFonts w:ascii="Times New Roman" w:hAnsi="Times New Roman"/>
+          <w:b/>
+          <w:color w:val="C00000"/>
+          <w:sz w:val="26"/>
+        </w:rPr>
+        <w:t>VIII. CƠ SỞ PHÁP LÝ HIỆN HÀNH (cập nhật 02/2025)</w:t>
+      </w:r>
+    </w:p>
+    <w:p>
+      <w:pPr>
+        <w:spacing w:before="160" w:after="60"/>
+      </w:pPr>
+      <w:r>
+        <w:rPr>
+          <w:rFonts w:ascii="Times New Roman" w:hAnsi="Times New Roman"/>
+          <w:b/>
+          <w:color w:val="2E74B5"/>
+          <w:sz w:val="24"/>
+        </w:rPr>
+        <w:t>8.1 — Văn bản gốc</w:t>
+      </w:r>
+    </w:p>
+    <w:p>
+      <w:pPr>
+        <w:spacing w:after="80"/>
+        <w:ind w:firstLine="283"/>
+        <w:jc w:val="both"/>
+      </w:pPr>
+      <w:r>
+        <w:rPr>
+          <w:rFonts w:ascii="Times New Roman" w:hAnsi="Times New Roman"/>
+          <w:sz w:val="22"/>
+        </w:rPr>
+        <w:t>Thông tư 43/2024/TT-BYT ban hành ngày 12/12/2024 bởi Bộ Y tế, có hiệu lực từ 01/02/2025, quy định việc thành lập, tổ chức và hoạt động của Hội đồng đạo đức trong nghiên cứu y sinh học (THAY THẾ Quyết định 111/QĐ-BYT năm 2013 cũ). Đây là văn bản chính thức hiện hành.</w:t>
+      </w:r>
+    </w:p>
+    <w:p>
+      <w:pPr>
+        <w:spacing w:after="80"/>
+        <w:ind w:firstLine="283"/>
+        <w:jc w:val="both"/>
+      </w:pPr>
+      <w:r>
+        <w:rPr>
+          <w:rFonts w:ascii="Times New Roman" w:hAnsi="Times New Roman"/>
+          <w:sz w:val="22"/>
+        </w:rPr>
+        <w:t>Link tra cứu: https://thuvienphapluat.vn/van-ban/Bo-may-hanh-chinh/Thong-tu-43-2024-TT-BYT-thanh-lap-Hoi-dong-dao-duc-trong-nghien-cuu-y-sinh-hoc-635867.aspx</w:t>
+      </w:r>
+    </w:p>
+    <w:p>
+      <w:pPr>
+        <w:spacing w:before="160" w:after="60"/>
+      </w:pPr>
+      <w:r>
+        <w:rPr>
+          <w:rFonts w:ascii="Times New Roman" w:hAnsi="Times New Roman"/>
+          <w:b/>
+          <w:color w:val="2E74B5"/>
+          <w:sz w:val="24"/>
+        </w:rPr>
+        <w:t>8.2 — 3 loại Quyết định mà HĐ Đạo đức ban hành (theo TT 43/2024)</w:t>
+      </w:r>
+    </w:p>
+    <w:p>
+      <w:pPr>
+        <w:spacing w:after="60"/>
+        <w:ind w:left="425"/>
+      </w:pPr>
+      <w:r>
+        <w:rPr>
+          <w:rFonts w:ascii="Times New Roman" w:hAnsi="Times New Roman"/>
+          <w:sz w:val="22"/>
+        </w:rPr>
+        <w:t>• Quyết định THẨM ĐỊNH: chấp thuận về khoa học và đạo đức đối với đề tài (mã + tên đề tài + tổ chức chủ trì + địa điểm + nhân sự)</w:t>
+      </w:r>
+    </w:p>
+    <w:p>
+      <w:pPr>
+        <w:spacing w:after="60"/>
+        <w:ind w:left="425"/>
+      </w:pPr>
+      <w:r>
+        <w:rPr>
+          <w:rFonts w:ascii="Times New Roman" w:hAnsi="Times New Roman"/>
+          <w:sz w:val="22"/>
+        </w:rPr>
+        <w:t>• Quyết định PHÊ DUYỆT: ban hành Quy chế tổ chức và hoạt động (cho cấp HĐ Đạo đức nội bộ)</w:t>
+      </w:r>
+    </w:p>
+    <w:p>
+      <w:pPr>
+        <w:spacing w:after="60"/>
+        <w:ind w:left="425"/>
+      </w:pPr>
+      <w:r>
+        <w:rPr>
+          <w:rFonts w:ascii="Times New Roman" w:hAnsi="Times New Roman"/>
+          <w:sz w:val="22"/>
+        </w:rPr>
+        <w:t>• Quyết định KẾT QUẢ: ghi nhận biến cố bất lợi nghiêm trọng (SUSAR), thay đổi nhân sự, dữ liệu cung cấp</w:t>
+      </w:r>
+    </w:p>
+    <w:p>
+      <w:pPr>
+        <w:spacing w:before="160" w:after="60"/>
+      </w:pPr>
+      <w:r>
+        <w:rPr>
+          <w:rFonts w:ascii="Times New Roman" w:hAnsi="Times New Roman"/>
+          <w:b/>
+          <w:color w:val="2E74B5"/>
+          <w:sz w:val="24"/>
+        </w:rPr>
+        <w:t>8.3 — Trách nhiệm chính của NCS sau khi nhận QĐ</w:t>
+      </w:r>
+    </w:p>
+    <w:p>
+      <w:pPr>
+        <w:spacing w:after="60"/>
+        <w:ind w:left="425"/>
+      </w:pPr>
+      <w:r>
+        <w:rPr>
+          <w:rFonts w:ascii="Times New Roman" w:hAnsi="Times New Roman"/>
+          <w:sz w:val="22"/>
+        </w:rPr>
+        <w:t>• Báo cáo HÀNG NĂM tiến độ nghiên cứu cho HĐ Đạo đức</w:t>
+      </w:r>
+    </w:p>
+    <w:p>
+      <w:pPr>
+        <w:spacing w:after="60"/>
+        <w:ind w:left="425"/>
+      </w:pPr>
+      <w:r>
+        <w:rPr>
+          <w:rFonts w:ascii="Times New Roman" w:hAnsi="Times New Roman"/>
+          <w:sz w:val="22"/>
+        </w:rPr>
+        <w:t>• Thông báo TỨC THỜI sự kiện bất lợi (nếu có)</w:t>
+      </w:r>
+    </w:p>
+    <w:p>
+      <w:pPr>
+        <w:spacing w:after="60"/>
+        <w:ind w:left="425"/>
+      </w:pPr>
+      <w:r>
+        <w:rPr>
+          <w:rFonts w:ascii="Times New Roman" w:hAnsi="Times New Roman"/>
+          <w:sz w:val="22"/>
+        </w:rPr>
+        <w:t>• Chuẩn bị kiểm tra địa điểm nghiên cứu khi HĐ yêu cầu</w:t>
+      </w:r>
+    </w:p>
+    <w:p>
+      <w:pPr>
+        <w:spacing w:before="280" w:after="120"/>
+      </w:pPr>
+      <w:r>
+        <w:rPr>
+          <w:rFonts w:ascii="Times New Roman" w:hAnsi="Times New Roman"/>
+          <w:b/>
+          <w:color w:val="C00000"/>
+          <w:sz w:val="26"/>
+        </w:rPr>
         <w:t>TÀI LIỆU THAM KHẢO</w:t>
       </w:r>
     </w:p>
@@ -1215,6 +1887,45 @@
           <w:sz w:val="20"/>
         </w:rPr>
         <w:t>• Trường Đại học Khoa học Xã hội và Nhân văn — ĐHQG TP.HCM. Quy chế tổ chức và hoạt động Hội đồng Đạo đức Nghiên cứu. URL: https://hcmussh.edu.vn/tin-tuc/ban-hanh-quy-che-to-chuc-va-hoat-dong-hoi-dong-dao-duc-nghien-cuu</w:t>
+      </w:r>
+    </w:p>
+    <w:p>
+      <w:pPr>
+        <w:spacing w:after="60"/>
+        <w:ind w:left="425" w:hanging="425"/>
+      </w:pPr>
+      <w:r>
+        <w:rPr>
+          <w:rFonts w:ascii="Times New Roman" w:hAnsi="Times New Roman"/>
+          <w:sz w:val="20"/>
+        </w:rPr>
+        <w:t>• Bộ Y tế. Thông tư 43/2024/TT-BYT ngày 12/12/2024 quy định việc thành lập, tổ chức và hoạt động của Hội đồng Đạo đức trong nghiên cứu y sinh học. Hiệu lực 01/02/2025. URL: https://thuvienphapluat.vn/van-ban/Bo-may-hanh-chinh/Thong-tu-43-2024-TT-BYT-thanh-lap-Hoi-dong-dao-duc-trong-nghien-cuu-y-sinh-hoc-635867.aspx</w:t>
+      </w:r>
+    </w:p>
+    <w:p>
+      <w:pPr>
+        <w:spacing w:after="60"/>
+        <w:ind w:left="425" w:hanging="425"/>
+      </w:pPr>
+      <w:r>
+        <w:rPr>
+          <w:rFonts w:ascii="Times New Roman" w:hAnsi="Times New Roman"/>
+          <w:sz w:val="20"/>
+        </w:rPr>
+        <w:t>• Trường Đại học Y Hà Nội (HMU). Hướng dẫn lập hồ sơ xin phê duyệt và nghiệm thu kết quả nghiên cứu, thực hiện đạo đức nghiên cứu của đề tài. PDF 24 trang, dựa trên QĐ 111/QĐ-BYT 2013. URL: https://sdh.hmu.edu.vn/images/HO%20SO%20XIN%20PHE%20DUYET%20DAO%20DUC%20TRONG%20NGHIEN%20CUU%20Y%20HOC.pdf</w:t>
+      </w:r>
+    </w:p>
+    <w:p>
+      <w:pPr>
+        <w:spacing w:after="60"/>
+        <w:ind w:left="425" w:hanging="425"/>
+      </w:pPr>
+      <w:r>
+        <w:rPr>
+          <w:rFonts w:ascii="Times New Roman" w:hAnsi="Times New Roman"/>
+          <w:sz w:val="20"/>
+        </w:rPr>
+        <w:t>• Bệnh viện Nguyễn Tri Phương. Quyết định 672/QĐ-BVNTP ngày 23/05/2025 về việc thành lập Hội đồng Đạo đức trong nghiên cứu y sinh học (ví dụ QĐ thành lập theo Thông tư 43/2024). URL: https://bvnguyentriphuong.com.vn/quy-trinh-thu-tuc-hanh-chinh/quyet-dinh-thanh-lap-hoi-dong-dao-duc-trong-nghien-cuu-y-sinh-hoc</w:t>
       </w:r>
     </w:p>
     <w:p>

</xml_diff>